<commit_message>
Add Flutter CV files
</commit_message>
<xml_diff>
--- a/assets/cvs/Front-End Flutter/Assem_habib_CV_Flutter.docx
+++ b/assets/cvs/Front-End Flutter/Assem_habib_CV_Flutter.docx
@@ -163,25 +163,7 @@
           <w:sz w:val="22"/>
           <w:szCs w:val="22"/>
         </w:rPr>
-        <w:t xml:space="preserve">Flutter Developer specialized in building scalable, high-performance, and production-ready mobile applications using Flutter and Dart. Experienced in designing modern application architectures using Clean Architecture, Feature-First structure, </w:t>
-      </w:r>
-      <w:proofErr w:type="spellStart"/>
-      <w:r>
-        <w:rPr>
-          <w:rFonts w:ascii="Calibri" w:hAnsi="Calibri" w:cs="Calibri"/>
-          <w:sz w:val="22"/>
-          <w:szCs w:val="22"/>
-        </w:rPr>
-        <w:t>Riverpod</w:t>
-      </w:r>
-      <w:proofErr w:type="spellEnd"/>
-      <w:r>
-        <w:rPr>
-          <w:rFonts w:ascii="Calibri" w:hAnsi="Calibri" w:cs="Calibri"/>
-          <w:sz w:val="22"/>
-          <w:szCs w:val="22"/>
-        </w:rPr>
-        <w:t>, and Provider. Developed real-world business applications including financial management systems, optimization platforms, reporting systems, and advanced dashboard interfaces. Skilled in RESTful API integration, Firebase services, offline storage, responsive UI design, performance optimization, and interactive data visualization. Passionate about building maintainable, visually polished, and user-centered mobile applications that deliver strong business value</w:t>
+        <w:t>Flutter Developer specialized in building scalable, high-performance, and production-ready mobile applications using Flutter and Dart. Experienced in designing modern application architectures using Clean Architecture, Feature-First structure, Riverpod, and Provider. Developed real-world business applications including financial management systems, optimization platforms, reporting systems, and advanced dashboard interfaces. Skilled in RESTful API integration, Firebase services, offline storage, responsive UI design, performance optimization, and interactive data visualization. Passionate about building maintainable, visually polished, and user-centered mobile applications that deliver strong business value</w:t>
       </w:r>
       <w:r>
         <w:rPr>
@@ -331,23 +313,7 @@
           <w:sz w:val="22"/>
           <w:szCs w:val="22"/>
         </w:rPr>
-        <w:t xml:space="preserve"> </w:t>
-      </w:r>
-      <w:r>
-        <w:rPr>
-          <w:rFonts w:ascii="Calibri" w:hAnsi="Calibri" w:cs="Calibri"/>
-          <w:sz w:val="22"/>
-          <w:szCs w:val="22"/>
-        </w:rPr>
-        <w:t>Flutter, Responsive UI, Adaptive Layouts, Material Design, Cross-Platform Developmen</w:t>
-      </w:r>
-      <w:r>
-        <w:rPr>
-          <w:rFonts w:ascii="Calibri" w:hAnsi="Calibri" w:cs="Calibri"/>
-          <w:sz w:val="22"/>
-          <w:szCs w:val="22"/>
-        </w:rPr>
-        <w:t>t.</w:t>
+        <w:t xml:space="preserve"> Flutter, Responsive UI, Adaptive Layouts, Material Design, Cross-Platform Development.</w:t>
       </w:r>
     </w:p>
     <w:p>
@@ -388,41 +354,7 @@
           <w:sz w:val="22"/>
           <w:szCs w:val="22"/>
         </w:rPr>
-        <w:t xml:space="preserve"> </w:t>
-      </w:r>
-      <w:r>
-        <w:rPr>
-          <w:rFonts w:ascii="Calibri" w:hAnsi="Calibri" w:cs="Calibri"/>
-          <w:sz w:val="22"/>
-          <w:szCs w:val="22"/>
-        </w:rPr>
-        <w:t xml:space="preserve">Clean Architecture, Feature-First Architecture, </w:t>
-      </w:r>
-      <w:proofErr w:type="spellStart"/>
-      <w:r>
-        <w:rPr>
-          <w:rFonts w:ascii="Calibri" w:hAnsi="Calibri" w:cs="Calibri"/>
-          <w:sz w:val="22"/>
-          <w:szCs w:val="22"/>
-        </w:rPr>
-        <w:t>Riverpod</w:t>
-      </w:r>
-      <w:proofErr w:type="spellEnd"/>
-      <w:r>
-        <w:rPr>
-          <w:rFonts w:ascii="Calibri" w:hAnsi="Calibri" w:cs="Calibri"/>
-          <w:sz w:val="22"/>
-          <w:szCs w:val="22"/>
-        </w:rPr>
-        <w:t>, Provider, Async State Managemen</w:t>
-      </w:r>
-      <w:r>
-        <w:rPr>
-          <w:rFonts w:ascii="Calibri" w:hAnsi="Calibri" w:cs="Calibri"/>
-          <w:sz w:val="22"/>
-          <w:szCs w:val="22"/>
-        </w:rPr>
-        <w:t>t.</w:t>
+        <w:t xml:space="preserve"> Clean Architecture, Feature-First Architecture, Riverpod, Provider, Async State Management.</w:t>
       </w:r>
     </w:p>
     <w:p>
@@ -469,25 +401,7 @@
           <w:sz w:val="22"/>
           <w:szCs w:val="22"/>
         </w:rPr>
-        <w:t xml:space="preserve">RESTful APIs, Firebase, Node.js, </w:t>
-      </w:r>
-      <w:proofErr w:type="spellStart"/>
-      <w:r>
-        <w:rPr>
-          <w:rFonts w:ascii="Calibri" w:hAnsi="Calibri" w:cs="Calibri"/>
-          <w:sz w:val="22"/>
-          <w:szCs w:val="22"/>
-        </w:rPr>
-        <w:t>NestJS</w:t>
-      </w:r>
-      <w:proofErr w:type="spellEnd"/>
-      <w:r>
-        <w:rPr>
-          <w:rFonts w:ascii="Calibri" w:hAnsi="Calibri" w:cs="Calibri"/>
-          <w:sz w:val="22"/>
-          <w:szCs w:val="22"/>
-        </w:rPr>
-        <w:t>, Express.js, Laravel</w:t>
+        <w:t>RESTful APIs, Firebase, Node.js, NestJS, Express.js, Laravel</w:t>
       </w:r>
       <w:r>
         <w:rPr>
@@ -544,25 +458,7 @@
           <w:sz w:val="22"/>
           <w:szCs w:val="22"/>
         </w:rPr>
-        <w:t xml:space="preserve">Drift (Moor), SQLite, </w:t>
-      </w:r>
-      <w:proofErr w:type="spellStart"/>
-      <w:r>
-        <w:rPr>
-          <w:rFonts w:ascii="Calibri" w:hAnsi="Calibri" w:cs="Calibri"/>
-          <w:sz w:val="22"/>
-          <w:szCs w:val="22"/>
-        </w:rPr>
-        <w:t>SharedPreferences</w:t>
-      </w:r>
-      <w:proofErr w:type="spellEnd"/>
-      <w:r>
-        <w:rPr>
-          <w:rFonts w:ascii="Calibri" w:hAnsi="Calibri" w:cs="Calibri"/>
-          <w:sz w:val="22"/>
-          <w:szCs w:val="22"/>
-        </w:rPr>
-        <w:t>, PostgreSQL, MySQL, Redis, SQL, NoSQL</w:t>
+        <w:t>Drift (Moor), SQLite, SharedPreferences, PostgreSQL, MySQL, Redis, SQL, NoSQL</w:t>
       </w:r>
       <w:r>
         <w:rPr>
@@ -615,49 +511,21 @@
         </w:rPr>
         <w:t xml:space="preserve"> </w:t>
       </w:r>
-      <w:proofErr w:type="spellStart"/>
-      <w:r>
-        <w:rPr>
-          <w:rFonts w:ascii="Calibri" w:hAnsi="Calibri" w:cs="Calibri"/>
-          <w:sz w:val="22"/>
-          <w:szCs w:val="22"/>
-        </w:rPr>
-        <w:t>Glassmorphism</w:t>
-      </w:r>
-      <w:proofErr w:type="spellEnd"/>
-      <w:r>
-        <w:rPr>
-          <w:rFonts w:ascii="Calibri" w:hAnsi="Calibri" w:cs="Calibri"/>
-          <w:sz w:val="22"/>
-          <w:szCs w:val="22"/>
-        </w:rPr>
-        <w:t xml:space="preserve"> UI, Custom Widgets, Animations, Interactive Dashboards, </w:t>
-      </w:r>
-      <w:proofErr w:type="spellStart"/>
-      <w:r>
-        <w:rPr>
-          <w:rFonts w:ascii="Calibri" w:hAnsi="Calibri" w:cs="Calibri"/>
-          <w:sz w:val="22"/>
-          <w:szCs w:val="22"/>
-        </w:rPr>
-        <w:t>fl_char</w:t>
-      </w:r>
-      <w:r>
-        <w:rPr>
-          <w:rFonts w:ascii="Calibri" w:hAnsi="Calibri" w:cs="Calibri"/>
-          <w:sz w:val="22"/>
-          <w:szCs w:val="22"/>
-        </w:rPr>
-        <w:t>t</w:t>
-      </w:r>
-      <w:proofErr w:type="spellEnd"/>
-      <w:r>
-        <w:rPr>
-          <w:rFonts w:ascii="Calibri" w:hAnsi="Calibri" w:cs="Calibri"/>
-          <w:sz w:val="22"/>
-          <w:szCs w:val="22"/>
-        </w:rPr>
-        <w:t>.</w:t>
+      <w:r>
+        <w:rPr>
+          <w:rFonts w:ascii="Calibri" w:hAnsi="Calibri" w:cs="Calibri"/>
+          <w:sz w:val="22"/>
+          <w:szCs w:val="22"/>
+        </w:rPr>
+        <w:t>Glassmorphism UI, Custom Widgets, Animations, Interactive Dashboards, fl_char</w:t>
+      </w:r>
+      <w:r>
+        <w:rPr>
+          <w:rFonts w:ascii="Calibri" w:hAnsi="Calibri" w:cs="Calibri"/>
+          <w:sz w:val="22"/>
+          <w:szCs w:val="22"/>
+        </w:rPr>
+        <w:t>t.</w:t>
       </w:r>
       <w:r>
         <w:rPr>
@@ -768,18 +636,8 @@
           <w:sz w:val="22"/>
           <w:szCs w:val="22"/>
         </w:rPr>
-        <w:t>Git, GitHub, GitLab, Agile, Jira, Swagger/</w:t>
-      </w:r>
-      <w:proofErr w:type="spellStart"/>
-      <w:r>
-        <w:rPr>
-          <w:rFonts w:ascii="Calibri" w:hAnsi="Calibri" w:cs="Calibri"/>
-          <w:sz w:val="22"/>
-          <w:szCs w:val="22"/>
-        </w:rPr>
-        <w:t>OpenAPI</w:t>
-      </w:r>
-      <w:proofErr w:type="spellEnd"/>
+        <w:t>Git, GitHub, GitLab, Agile, Jira, Swagger/OpenAPI</w:t>
+      </w:r>
       <w:r>
         <w:rPr>
           <w:rFonts w:ascii="Calibri" w:hAnsi="Calibri" w:cs="Calibri"/>
@@ -827,15 +685,15 @@
           <w:rFonts w:ascii="Calibri" w:hAnsi="Calibri" w:cs="Calibri"/>
           <w:b/>
           <w:bCs/>
-        </w:rPr>
-      </w:pPr>
-      <w:r>
-        <w:rPr>
-          <w:rFonts w:ascii="Calibri" w:hAnsi="Calibri" w:cs="Calibri"/>
-          <w:b/>
-          <w:bCs/>
-        </w:rPr>
-        <w:lastRenderedPageBreak/>
+          <w:rtl/>
+        </w:rPr>
+      </w:pPr>
+      <w:r>
+        <w:rPr>
+          <w:rFonts w:ascii="Calibri" w:hAnsi="Calibri" w:cs="Calibri"/>
+          <w:b/>
+          <w:bCs/>
+        </w:rPr>
         <w:t>Shift Pay – Smart HR &amp; Financial Management System</w:t>
       </w:r>
     </w:p>
@@ -857,7 +715,7 @@
           <w:sz w:val="22"/>
           <w:szCs w:val="22"/>
         </w:rPr>
-        <w:t>AI-Powered Employee, Payroll &amp; Financial Management Platform</w:t>
+        <w:t>Developed a large-scale Flutter application for managing employees, payroll, attendance, inventory, and financial operations with modern Glassmorphism UI and responsive design</w:t>
       </w:r>
       <w:r>
         <w:rPr>
@@ -886,7 +744,7 @@
           <w:sz w:val="22"/>
           <w:szCs w:val="22"/>
         </w:rPr>
-        <w:t>Developed a large-scale Flutter application for managing employees, payroll, attendance, inventory, and financial operations for small and medium-sized businesses</w:t>
+        <w:t>Built a smart voice-command processing system supporting Egyptian Arabic dialect for attendance, withdrawals, leaves, and financial operations using custom intent parsing and Arabic text normalization</w:t>
       </w:r>
       <w:r>
         <w:rPr>
@@ -915,25 +773,8 @@
           <w:sz w:val="22"/>
           <w:szCs w:val="22"/>
         </w:rPr>
-        <w:t xml:space="preserve">Designed and implemented a modern </w:t>
-      </w:r>
-      <w:proofErr w:type="spellStart"/>
-      <w:r>
-        <w:rPr>
-          <w:rFonts w:ascii="Calibri" w:hAnsi="Calibri" w:cs="Calibri"/>
-          <w:sz w:val="22"/>
-          <w:szCs w:val="22"/>
-        </w:rPr>
-        <w:t>Glassmorphism</w:t>
-      </w:r>
-      <w:proofErr w:type="spellEnd"/>
-      <w:r>
-        <w:rPr>
-          <w:rFonts w:ascii="Calibri" w:hAnsi="Calibri" w:cs="Calibri"/>
-          <w:sz w:val="22"/>
-          <w:szCs w:val="22"/>
-        </w:rPr>
-        <w:t>-based UI system with responsive layouts, advanced theming, smooth animations, and optimized user experience workflows</w:t>
+        <w:lastRenderedPageBreak/>
+        <w:t>Implemented advanced payroll, attendance, and inventory management systems with complex business logic, PDF reporting, analytics dashboards, and interactive data visualization</w:t>
       </w:r>
       <w:r>
         <w:rPr>
@@ -962,7 +803,7 @@
           <w:sz w:val="22"/>
           <w:szCs w:val="22"/>
         </w:rPr>
-        <w:t>Built an AI-powered voice assistant supporting Egyptian Arabic dialect for smart attendance, withdrawals, leave requests, and financial operations using natural voice commands</w:t>
+        <w:t>Designed the application using Clean Architecture, Feature-First structure, Cubit state management, Drift reactive database, and modular scalable architecture for high performance and maintainability</w:t>
       </w:r>
       <w:r>
         <w:rPr>
@@ -975,103 +816,20 @@
     </w:p>
     <w:p>
       <w:pPr>
-        <w:numPr>
-          <w:ilvl w:val="0"/>
-          <w:numId w:val="2"/>
-        </w:numPr>
-        <w:rPr>
-          <w:rFonts w:ascii="Calibri" w:hAnsi="Calibri" w:cs="Calibri"/>
-          <w:sz w:val="22"/>
-          <w:szCs w:val="22"/>
-        </w:rPr>
-      </w:pPr>
-      <w:r>
-        <w:rPr>
-          <w:rFonts w:ascii="Calibri" w:hAnsi="Calibri" w:cs="Calibri"/>
-          <w:sz w:val="22"/>
-          <w:szCs w:val="22"/>
-        </w:rPr>
-        <w:t>Implemented advanced payroll and attendance calculation engines supporting overtime, penalties, bonuses, shift management, daily/hourly salary systems, and cross-day shifts</w:t>
-      </w:r>
-      <w:r>
-        <w:rPr>
-          <w:rFonts w:ascii="Calibri" w:hAnsi="Calibri" w:cs="Calibri"/>
-          <w:sz w:val="22"/>
-          <w:szCs w:val="22"/>
-        </w:rPr>
-        <w:t>.</w:t>
-      </w:r>
-    </w:p>
-    <w:p>
-      <w:pPr>
-        <w:numPr>
-          <w:ilvl w:val="0"/>
-          <w:numId w:val="2"/>
-        </w:numPr>
-        <w:rPr>
-          <w:rFonts w:ascii="Calibri" w:hAnsi="Calibri" w:cs="Calibri"/>
-          <w:sz w:val="22"/>
-          <w:szCs w:val="22"/>
-        </w:rPr>
-      </w:pPr>
-      <w:r>
-        <w:rPr>
-          <w:rFonts w:ascii="Calibri" w:hAnsi="Calibri" w:cs="Calibri"/>
-          <w:sz w:val="22"/>
-          <w:szCs w:val="22"/>
-        </w:rPr>
-        <w:t xml:space="preserve">Developed a complete inventory management system with stock tracking, </w:t>
-      </w:r>
-      <w:proofErr w:type="spellStart"/>
-      <w:r>
-        <w:rPr>
-          <w:rFonts w:ascii="Calibri" w:hAnsi="Calibri" w:cs="Calibri"/>
-          <w:sz w:val="22"/>
-          <w:szCs w:val="22"/>
-        </w:rPr>
-        <w:t>stocktake</w:t>
-      </w:r>
-      <w:proofErr w:type="spellEnd"/>
-      <w:r>
-        <w:rPr>
-          <w:rFonts w:ascii="Calibri" w:hAnsi="Calibri" w:cs="Calibri"/>
-          <w:sz w:val="22"/>
-          <w:szCs w:val="22"/>
-        </w:rPr>
-        <w:t xml:space="preserve"> workflows, low-stock alerts, and financial analytics dashboards</w:t>
-      </w:r>
-      <w:r>
-        <w:rPr>
-          <w:rFonts w:ascii="Calibri" w:hAnsi="Calibri" w:cs="Calibri"/>
-          <w:sz w:val="22"/>
-          <w:szCs w:val="22"/>
-        </w:rPr>
-        <w:t>.</w:t>
-      </w:r>
-    </w:p>
-    <w:p>
-      <w:pPr>
-        <w:rPr>
-          <w:rFonts w:ascii="Calibri" w:hAnsi="Calibri" w:cs="Calibri"/>
-        </w:rPr>
-      </w:pPr>
-      <w:proofErr w:type="spellStart"/>
-      <w:r>
-        <w:rPr>
-          <w:rFonts w:ascii="Calibri" w:hAnsi="Calibri" w:cs="Calibri"/>
-          <w:b/>
-          <w:bCs/>
-        </w:rPr>
-        <w:t>StitchHub</w:t>
-      </w:r>
-      <w:proofErr w:type="spellEnd"/>
-      <w:r>
-        <w:rPr>
-          <w:rFonts w:ascii="Calibri" w:hAnsi="Calibri" w:cs="Calibri"/>
-          <w:b/>
-          <w:bCs/>
-        </w:rPr>
-        <w:t xml:space="preserve"> – Tailoring E-Commerce Platform</w:t>
+        <w:rPr>
+          <w:rFonts w:ascii="Calibri" w:hAnsi="Calibri" w:cs="Calibri"/>
+          <w:b/>
+          <w:bCs/>
+          <w:rtl/>
+        </w:rPr>
+      </w:pPr>
+      <w:r>
+        <w:rPr>
+          <w:rFonts w:ascii="Calibri" w:hAnsi="Calibri" w:cs="Calibri"/>
+          <w:b/>
+          <w:bCs/>
+        </w:rPr>
+        <w:t>Sajadi – Cut Optimizer Mobile</w:t>
       </w:r>
     </w:p>
     <w:p>
@@ -1082,13 +840,25 @@
         </w:numPr>
         <w:rPr>
           <w:rFonts w:ascii="Calibri" w:hAnsi="Calibri" w:cs="Calibri"/>
-        </w:rPr>
-      </w:pPr>
-      <w:r>
-        <w:rPr>
-          <w:rFonts w:ascii="Calibri" w:hAnsi="Calibri" w:cs="Calibri"/>
-        </w:rPr>
-        <w:t>Developed a full-featured e-commerce platform with Laravel and Blade.</w:t>
+          <w:sz w:val="22"/>
+          <w:szCs w:val="22"/>
+        </w:rPr>
+      </w:pPr>
+      <w:r>
+        <w:rPr>
+          <w:rFonts w:ascii="Calibri" w:hAnsi="Calibri" w:cs="Calibri"/>
+          <w:sz w:val="22"/>
+          <w:szCs w:val="22"/>
+        </w:rPr>
+        <w:t>Developed a Flutter application for optimizing carpet and fabric cutting operations using mathematical optimization workflows and intelligent grouping algorithms to reduce material waste</w:t>
+      </w:r>
+      <w:r>
+        <w:rPr>
+          <w:rFonts w:ascii="Calibri" w:hAnsi="Calibri" w:cs="Calibri"/>
+          <w:sz w:val="22"/>
+          <w:szCs w:val="22"/>
+        </w:rPr>
+        <w:t>.</w:t>
       </w:r>
     </w:p>
     <w:p>
@@ -1099,13 +869,25 @@
         </w:numPr>
         <w:rPr>
           <w:rFonts w:ascii="Calibri" w:hAnsi="Calibri" w:cs="Calibri"/>
-        </w:rPr>
-      </w:pPr>
-      <w:r>
-        <w:rPr>
-          <w:rFonts w:ascii="Calibri" w:hAnsi="Calibri" w:cs="Calibri"/>
-        </w:rPr>
-        <w:t>Built CRUD operations, admin dashboard, billing, and user management.</w:t>
+          <w:sz w:val="22"/>
+          <w:szCs w:val="22"/>
+        </w:rPr>
+      </w:pPr>
+      <w:r>
+        <w:rPr>
+          <w:rFonts w:ascii="Calibri" w:hAnsi="Calibri" w:cs="Calibri"/>
+          <w:sz w:val="22"/>
+          <w:szCs w:val="22"/>
+        </w:rPr>
+        <w:t>Implemented Excel import/export systems, PDF reporting, analytics dashboards, and interactive statistical visualizations for industrial workflow management</w:t>
+      </w:r>
+      <w:r>
+        <w:rPr>
+          <w:rFonts w:ascii="Calibri" w:hAnsi="Calibri" w:cs="Calibri"/>
+          <w:sz w:val="22"/>
+          <w:szCs w:val="22"/>
+        </w:rPr>
+        <w:t>.</w:t>
       </w:r>
     </w:p>
     <w:p>
@@ -1116,38 +898,71 @@
         </w:numPr>
         <w:rPr>
           <w:rFonts w:ascii="Calibri" w:hAnsi="Calibri" w:cs="Calibri"/>
-        </w:rPr>
-      </w:pPr>
-      <w:r>
-        <w:rPr>
-          <w:rFonts w:ascii="Calibri" w:hAnsi="Calibri" w:cs="Calibri"/>
-        </w:rPr>
-        <w:t>Integrated SEO optimization and multi-language support (Arabic/English).</w:t>
-      </w:r>
-    </w:p>
-    <w:p>
-      <w:pPr>
-        <w:rPr>
-          <w:rFonts w:ascii="Calibri" w:hAnsi="Calibri" w:cs="Calibri"/>
-        </w:rPr>
-      </w:pPr>
-      <w:proofErr w:type="spellStart"/>
-      <w:r>
-        <w:rPr>
-          <w:rFonts w:ascii="Calibri" w:hAnsi="Calibri" w:cs="Calibri"/>
-          <w:b/>
-          <w:bCs/>
-        </w:rPr>
-        <w:t>BeautyHub</w:t>
-      </w:r>
-      <w:proofErr w:type="spellEnd"/>
-      <w:r>
-        <w:rPr>
-          <w:rFonts w:ascii="Calibri" w:hAnsi="Calibri" w:cs="Calibri"/>
-          <w:b/>
-          <w:bCs/>
-        </w:rPr>
-        <w:t xml:space="preserve"> – Salon Management Backend (Node.js)</w:t>
+          <w:sz w:val="22"/>
+          <w:szCs w:val="22"/>
+        </w:rPr>
+      </w:pPr>
+      <w:r>
+        <w:rPr>
+          <w:rFonts w:ascii="Calibri" w:hAnsi="Calibri" w:cs="Calibri"/>
+          <w:sz w:val="22"/>
+          <w:szCs w:val="22"/>
+        </w:rPr>
+        <w:t>Built responsive Arabic RTL interfaces with modern Glassmorphism UI, customizable themes, and performance-optimized background processing for handling large datasets</w:t>
+      </w:r>
+      <w:r>
+        <w:rPr>
+          <w:rFonts w:ascii="Calibri" w:hAnsi="Calibri" w:cs="Calibri"/>
+          <w:sz w:val="22"/>
+          <w:szCs w:val="22"/>
+        </w:rPr>
+        <w:t>.</w:t>
+      </w:r>
+    </w:p>
+    <w:p>
+      <w:pPr>
+        <w:numPr>
+          <w:ilvl w:val="0"/>
+          <w:numId w:val="3"/>
+        </w:numPr>
+        <w:rPr>
+          <w:rFonts w:ascii="Calibri" w:hAnsi="Calibri" w:cs="Calibri"/>
+          <w:sz w:val="22"/>
+          <w:szCs w:val="22"/>
+        </w:rPr>
+      </w:pPr>
+      <w:r>
+        <w:rPr>
+          <w:rFonts w:ascii="Calibri" w:hAnsi="Calibri" w:cs="Calibri"/>
+          <w:sz w:val="22"/>
+          <w:szCs w:val="22"/>
+        </w:rPr>
+        <w:t>Designed the application using modular architecture, validation systems, configurable processing workflows, and local file management solutions</w:t>
+      </w:r>
+      <w:r>
+        <w:rPr>
+          <w:rFonts w:ascii="Calibri" w:hAnsi="Calibri" w:cs="Calibri"/>
+          <w:sz w:val="22"/>
+          <w:szCs w:val="22"/>
+        </w:rPr>
+        <w:t>.</w:t>
+      </w:r>
+    </w:p>
+    <w:p>
+      <w:pPr>
+        <w:rPr>
+          <w:rFonts w:ascii="Calibri" w:hAnsi="Calibri" w:cs="Calibri"/>
+          <w:b/>
+          <w:bCs/>
+        </w:rPr>
+      </w:pPr>
+      <w:r>
+        <w:rPr>
+          <w:rFonts w:ascii="Calibri" w:hAnsi="Calibri" w:cs="Calibri"/>
+          <w:b/>
+          <w:bCs/>
+        </w:rPr>
+        <w:t>Mizaneyati Pro – Personal Finance Management System</w:t>
       </w:r>
     </w:p>
     <w:p>
@@ -1158,13 +973,25 @@
         </w:numPr>
         <w:rPr>
           <w:rFonts w:ascii="Calibri" w:hAnsi="Calibri" w:cs="Calibri"/>
-        </w:rPr>
-      </w:pPr>
-      <w:r>
-        <w:rPr>
-          <w:rFonts w:ascii="Calibri" w:hAnsi="Calibri" w:cs="Calibri"/>
-        </w:rPr>
-        <w:t>Developed backend APIs for managing services, appointments, and users.</w:t>
+          <w:sz w:val="22"/>
+          <w:szCs w:val="22"/>
+        </w:rPr>
+      </w:pPr>
+      <w:r>
+        <w:rPr>
+          <w:rFonts w:ascii="Calibri" w:hAnsi="Calibri" w:cs="Calibri"/>
+          <w:sz w:val="22"/>
+          <w:szCs w:val="22"/>
+        </w:rPr>
+        <w:t>Built a scalable personal finance management application using Flutter, Riverpod, Drift, and Clean Architecture principles</w:t>
+      </w:r>
+      <w:r>
+        <w:rPr>
+          <w:rFonts w:ascii="Calibri" w:hAnsi="Calibri" w:cs="Calibri"/>
+          <w:sz w:val="22"/>
+          <w:szCs w:val="22"/>
+        </w:rPr>
+        <w:t>.</w:t>
       </w:r>
     </w:p>
     <w:p>
@@ -1175,13 +1002,33 @@
         </w:numPr>
         <w:rPr>
           <w:rFonts w:ascii="Calibri" w:hAnsi="Calibri" w:cs="Calibri"/>
-        </w:rPr>
-      </w:pPr>
-      <w:r>
-        <w:rPr>
-          <w:rFonts w:ascii="Calibri" w:hAnsi="Calibri" w:cs="Calibri"/>
-        </w:rPr>
-        <w:t> Integrated Passport.js with social login providers (Google, Facebook), streamlining the user authentication process, which led to a 15% increase in user registrations and improved user experience.</w:t>
+          <w:sz w:val="22"/>
+          <w:szCs w:val="22"/>
+        </w:rPr>
+      </w:pPr>
+      <w:r>
+        <w:rPr>
+          <w:rFonts w:ascii="Calibri" w:hAnsi="Calibri" w:cs="Calibri"/>
+          <w:sz w:val="22"/>
+          <w:szCs w:val="22"/>
+        </w:rPr>
+        <w:t> </w:t>
+      </w:r>
+      <w:r>
+        <w:rPr>
+          <w:rFonts w:ascii="Calibri" w:hAnsi="Calibri" w:cs="Calibri"/>
+          <w:sz w:val="22"/>
+          <w:szCs w:val="22"/>
+        </w:rPr>
+        <w:t>Developed transaction management, budgeting systems, financial analytics dashboards, and multi-account workflows with strong validation and reactive local storage</w:t>
+      </w:r>
+      <w:r>
+        <w:rPr>
+          <w:rFonts w:ascii="Calibri" w:hAnsi="Calibri" w:cs="Calibri"/>
+          <w:sz w:val="22"/>
+          <w:szCs w:val="22"/>
+        </w:rPr>
+        <w:t>.</w:t>
       </w:r>
     </w:p>
     <w:p>
@@ -1192,200 +1039,47 @@
         </w:numPr>
         <w:rPr>
           <w:rFonts w:ascii="Calibri" w:hAnsi="Calibri" w:cs="Calibri"/>
-        </w:rPr>
-      </w:pPr>
-      <w:r>
-        <w:rPr>
-          <w:rFonts w:ascii="Calibri" w:hAnsi="Calibri" w:cs="Calibri"/>
-        </w:rPr>
-        <w:t>Built modular structure for integration with frontend/mobile clients.</w:t>
-      </w:r>
-    </w:p>
-    <w:p>
-      <w:pPr>
-        <w:rPr>
-          <w:rFonts w:ascii="Calibri" w:hAnsi="Calibri" w:cs="Calibri"/>
-          <w:b/>
-          <w:bCs/>
-        </w:rPr>
-      </w:pPr>
-      <w:r>
-        <w:rPr>
-          <w:rFonts w:ascii="Calibri" w:hAnsi="Calibri" w:cs="Calibri"/>
-          <w:b/>
-          <w:bCs/>
-        </w:rPr>
-        <w:t>Freelance</w:t>
-      </w:r>
-      <w:r>
-        <w:rPr>
-          <w:rFonts w:ascii="Calibri" w:hAnsi="Calibri" w:cs="Calibri"/>
-          <w:b/>
-          <w:bCs/>
-        </w:rPr>
-        <w:t>:</w:t>
-      </w:r>
-    </w:p>
-    <w:p>
-      <w:pPr>
-        <w:rPr>
-          <w:rFonts w:ascii="Calibri" w:hAnsi="Calibri" w:cs="Calibri"/>
-          <w:b/>
-          <w:bCs/>
-        </w:rPr>
-      </w:pPr>
-      <w:r>
-        <w:rPr>
-          <w:rFonts w:ascii="Calibri" w:hAnsi="Calibri" w:cs="Calibri"/>
-          <w:b/>
-          <w:bCs/>
-        </w:rPr>
-        <w:t xml:space="preserve">Freelance Project – </w:t>
-      </w:r>
-      <w:proofErr w:type="spellStart"/>
-      <w:r>
-        <w:rPr>
-          <w:rFonts w:ascii="Calibri" w:hAnsi="Calibri" w:cs="Calibri"/>
-          <w:b/>
-          <w:bCs/>
-        </w:rPr>
-        <w:t>CutOptimizer</w:t>
-      </w:r>
-      <w:proofErr w:type="spellEnd"/>
-      <w:r>
-        <w:rPr>
-          <w:rFonts w:ascii="Calibri" w:hAnsi="Calibri" w:cs="Calibri"/>
-          <w:b/>
-          <w:bCs/>
-        </w:rPr>
-        <w:t xml:space="preserve"> (Smart Carpet Cutting Tool)</w:t>
-      </w:r>
-    </w:p>
-    <w:p>
-      <w:pPr>
-        <w:rPr>
-          <w:rFonts w:ascii="Calibri" w:hAnsi="Calibri" w:cs="Calibri"/>
-        </w:rPr>
-      </w:pPr>
-      <w:r>
-        <w:rPr>
-          <w:rFonts w:ascii="Calibri" w:hAnsi="Calibri" w:cs="Calibri"/>
-        </w:rPr>
-        <w:t xml:space="preserve">• Developed a freelance project titled </w:t>
-      </w:r>
-      <w:proofErr w:type="spellStart"/>
-      <w:r>
-        <w:rPr>
-          <w:rFonts w:ascii="Calibri" w:hAnsi="Calibri" w:cs="Calibri"/>
-          <w:i/>
-          <w:iCs/>
-        </w:rPr>
-        <w:t>CutOptimizer</w:t>
-      </w:r>
-      <w:proofErr w:type="spellEnd"/>
-      <w:r>
-        <w:rPr>
-          <w:rFonts w:ascii="Calibri" w:hAnsi="Calibri" w:cs="Calibri"/>
-        </w:rPr>
-        <w:t>, a smart carpet cutting optimization tool designed to minimize material waste and improve efficiency using a greedy algorithm.</w:t>
-      </w:r>
-      <w:r>
-        <w:rPr>
-          <w:rFonts w:ascii="Calibri" w:hAnsi="Calibri" w:cs="Calibri"/>
-        </w:rPr>
-        <w:br/>
-        <w:t xml:space="preserve">• Built an interactive Arabic GUI using </w:t>
-      </w:r>
-      <w:r>
-        <w:rPr>
-          <w:rFonts w:ascii="Calibri" w:hAnsi="Calibri" w:cs="Calibri"/>
-          <w:b/>
-          <w:bCs/>
-        </w:rPr>
-        <w:t>Python (PySide6)</w:t>
-      </w:r>
-      <w:r>
-        <w:rPr>
-          <w:rFonts w:ascii="Calibri" w:hAnsi="Calibri" w:cs="Calibri"/>
-        </w:rPr>
-        <w:t xml:space="preserve"> for seamless user experience and data input.</w:t>
-      </w:r>
-      <w:r>
-        <w:rPr>
-          <w:rFonts w:ascii="Calibri" w:hAnsi="Calibri" w:cs="Calibri"/>
-        </w:rPr>
-        <w:br/>
-      </w:r>
-      <w:r>
-        <w:rPr>
-          <w:rFonts w:ascii="Calibri" w:hAnsi="Calibri" w:cs="Calibri"/>
-        </w:rPr>
-        <w:lastRenderedPageBreak/>
-        <w:t xml:space="preserve">• Implemented automated import/export functionality with </w:t>
-      </w:r>
-      <w:r>
-        <w:rPr>
-          <w:rFonts w:ascii="Calibri" w:hAnsi="Calibri" w:cs="Calibri"/>
-          <w:b/>
-          <w:bCs/>
-        </w:rPr>
-        <w:t>Excel</w:t>
-      </w:r>
-      <w:r>
-        <w:rPr>
-          <w:rFonts w:ascii="Calibri" w:hAnsi="Calibri" w:cs="Calibri"/>
-        </w:rPr>
-        <w:t xml:space="preserve"> and </w:t>
-      </w:r>
-      <w:r>
-        <w:rPr>
-          <w:rFonts w:ascii="Calibri" w:hAnsi="Calibri" w:cs="Calibri"/>
-          <w:b/>
-          <w:bCs/>
-        </w:rPr>
-        <w:t>PDF</w:t>
-      </w:r>
-      <w:r>
-        <w:rPr>
-          <w:rFonts w:ascii="Calibri" w:hAnsi="Calibri" w:cs="Calibri"/>
-        </w:rPr>
-        <w:t xml:space="preserve"> reporting.</w:t>
-      </w:r>
-      <w:r>
-        <w:rPr>
-          <w:rFonts w:ascii="Calibri" w:hAnsi="Calibri" w:cs="Calibri"/>
-        </w:rPr>
-        <w:br/>
-        <w:t xml:space="preserve">• Improved cutting efficiency by up to </w:t>
-      </w:r>
-      <w:r>
-        <w:rPr>
-          <w:rFonts w:ascii="Calibri" w:hAnsi="Calibri" w:cs="Calibri"/>
-          <w:b/>
-          <w:bCs/>
-        </w:rPr>
-        <w:t>30%</w:t>
-      </w:r>
-      <w:r>
-        <w:rPr>
-          <w:rFonts w:ascii="Calibri" w:hAnsi="Calibri" w:cs="Calibri"/>
-        </w:rPr>
-        <w:t>, enabling accurate and fast optimization based on custom size constraints.</w:t>
-      </w:r>
-      <w:r>
-        <w:rPr>
-          <w:rFonts w:ascii="Calibri" w:hAnsi="Calibri" w:cs="Calibri"/>
-        </w:rPr>
-        <w:br/>
-        <w:t>• Handled the full development cycle independently — from algorithm design to deployment — showcasing strong problem-solving and innovation skills.</w:t>
-      </w:r>
-    </w:p>
-    <w:p>
-      <w:pPr>
-        <w:rPr>
-          <w:rFonts w:ascii="Calibri" w:hAnsi="Calibri" w:cs="Calibri"/>
-        </w:rPr>
-      </w:pPr>
+          <w:sz w:val="22"/>
+          <w:szCs w:val="22"/>
+        </w:rPr>
+      </w:pPr>
+      <w:r>
+        <w:rPr>
+          <w:rFonts w:ascii="Calibri" w:hAnsi="Calibri" w:cs="Calibri"/>
+          <w:sz w:val="22"/>
+          <w:szCs w:val="22"/>
+        </w:rPr>
+        <w:t>Implemented interactive charts, reusable UI systems, responsive layouts, and modern animated interfaces for enhanced user experience</w:t>
+      </w:r>
+      <w:r>
+        <w:rPr>
+          <w:rFonts w:ascii="Calibri" w:hAnsi="Calibri" w:cs="Calibri"/>
+          <w:sz w:val="22"/>
+          <w:szCs w:val="22"/>
+        </w:rPr>
+        <w:t>.</w:t>
+      </w:r>
+    </w:p>
+    <w:p>
+      <w:pPr>
+        <w:numPr>
+          <w:ilvl w:val="0"/>
+          <w:numId w:val="5"/>
+        </w:numPr>
+        <w:rPr>
+          <w:rFonts w:ascii="Calibri" w:hAnsi="Calibri" w:cs="Calibri"/>
+          <w:sz w:val="22"/>
+          <w:szCs w:val="22"/>
+        </w:rPr>
+      </w:pPr>
+      <w:r>
+        <w:rPr>
+          <w:rFonts w:ascii="Calibri" w:hAnsi="Calibri" w:cs="Calibri"/>
+          <w:sz w:val="22"/>
+          <w:szCs w:val="22"/>
+        </w:rPr>
+        <w:t>Designed modular architecture with type-safe database operations, maintainable business logic, and scalable state management workflows</w:t>
+      </w:r>
     </w:p>
     <w:p>
       <w:pPr>
@@ -1577,14 +1271,8 @@
       </w:pPr>
     </w:p>
     <w:sectPr>
-      <w:headerReference w:type="even" r:id="rId10"/>
-      <w:headerReference w:type="default" r:id="rId11"/>
-      <w:footerReference w:type="even" r:id="rId12"/>
-      <w:footerReference w:type="default" r:id="rId13"/>
-      <w:headerReference w:type="first" r:id="rId14"/>
-      <w:footerReference w:type="first" r:id="rId15"/>
       <w:pgSz w:w="12240" w:h="15840"/>
-      <w:pgMar w:top="1440" w:right="1800" w:bottom="1440" w:left="1800" w:header="708" w:footer="708" w:gutter="0"/>
+      <w:pgMar w:top="990" w:right="810" w:bottom="810" w:left="810" w:header="708" w:footer="708" w:gutter="0"/>
       <w:cols w:space="708"/>
       <w:docGrid w:linePitch="360"/>
     </w:sectPr>
@@ -1617,36 +1305,6 @@
 </w:endnotes>
 </file>
 
-<file path=word/footer1.xml><?xml version="1.0" encoding="utf-8"?>
-<w:ftr xmlns:wpc="http://schemas.microsoft.com/office/word/2010/wordprocessingCanvas" xmlns:cx="http://schemas.microsoft.com/office/drawing/2014/chartex" xmlns:cx1="http://schemas.microsoft.com/office/drawing/2015/9/8/chartex" xmlns:cx2="http://schemas.microsoft.com/office/drawing/2015/10/21/chartex" xmlns:cx3="http://schemas.microsoft.com/office/drawing/2016/5/9/chartex" xmlns:cx4="http://schemas.microsoft.com/office/drawing/2016/5/10/chartex" xmlns:cx5="http://schemas.microsoft.com/office/drawing/2016/5/11/chartex" xmlns:cx6="http://schemas.microsoft.com/office/drawing/2016/5/12/chartex" xmlns:cx7="http://schemas.microsoft.com/office/drawing/2016/5/13/chartex" xmlns:cx8="http://schemas.microsoft.com/office/drawing/2016/5/14/chartex" xmlns:mc="http://schemas.openxmlformats.org/markup-compatibility/2006" xmlns:aink="http://schemas.microsoft.com/office/drawing/2016/ink" xmlns:am3d="http://schemas.microsoft.com/office/drawing/2017/model3d" xmlns:o="urn:schemas-microsoft-com:office:office" xmlns:oel="http://schemas.microsoft.com/office/2019/extlst" xmlns:r="http://schemas.openxmlformats.org/officeDocument/2006/relationships" xmlns:m="http://schemas.openxmlformats.org/officeDocument/2006/math" xmlns:v="urn:schemas-microsoft-com:vml" xmlns:wp14="http://schemas.microsoft.com/office/word/2010/wordprocessingDrawing" xmlns:wp="http://schemas.openxmlformats.org/drawingml/2006/wordprocessingDrawing" xmlns:w10="urn:schemas-microsoft-com:office:word" xmlns:w="http://schemas.openxmlformats.org/wordprocessingml/2006/main" xmlns:w14="http://schemas.microsoft.com/office/word/2010/wordml" xmlns:w15="http://schemas.microsoft.com/office/word/2012/wordml" xmlns:w16cex="http://schemas.microsoft.com/office/word/2018/wordml/cex" xmlns:w16cid="http://schemas.microsoft.com/office/word/2016/wordml/cid" xmlns:w16="http://schemas.microsoft.com/office/word/2018/wordml" xmlns:w16du="http://schemas.microsoft.com/office/word/2023/wordml/word16du" xmlns:w16sdtdh="http://schemas.microsoft.com/office/word/2020/wordml/sdtdatahash" xmlns:w16sdtfl="http://schemas.microsoft.com/office/word/2024/wordml/sdtformatlock" xmlns:w16se="http://schemas.microsoft.com/office/word/2015/wordml/symex" xmlns:wpg="http://schemas.microsoft.com/office/word/2010/wordprocessingGroup" xmlns:wpi="http://schemas.microsoft.com/office/word/2010/wordprocessingInk" xmlns:wne="http://schemas.microsoft.com/office/word/2006/wordml" xmlns:wps="http://schemas.microsoft.com/office/word/2010/wordprocessingShape" mc:Ignorable="w14 w15 w16se w16cid w16 w16cex w16sdtdh w16sdtfl w16du wp14">
-  <w:p>
-    <w:pPr>
-      <w:pStyle w:val="Footer"/>
-    </w:pPr>
-  </w:p>
-</w:ftr>
-</file>
-
-<file path=word/footer2.xml><?xml version="1.0" encoding="utf-8"?>
-<w:ftr xmlns:wpc="http://schemas.microsoft.com/office/word/2010/wordprocessingCanvas" xmlns:cx="http://schemas.microsoft.com/office/drawing/2014/chartex" xmlns:cx1="http://schemas.microsoft.com/office/drawing/2015/9/8/chartex" xmlns:cx2="http://schemas.microsoft.com/office/drawing/2015/10/21/chartex" xmlns:cx3="http://schemas.microsoft.com/office/drawing/2016/5/9/chartex" xmlns:cx4="http://schemas.microsoft.com/office/drawing/2016/5/10/chartex" xmlns:cx5="http://schemas.microsoft.com/office/drawing/2016/5/11/chartex" xmlns:cx6="http://schemas.microsoft.com/office/drawing/2016/5/12/chartex" xmlns:cx7="http://schemas.microsoft.com/office/drawing/2016/5/13/chartex" xmlns:cx8="http://schemas.microsoft.com/office/drawing/2016/5/14/chartex" xmlns:mc="http://schemas.openxmlformats.org/markup-compatibility/2006" xmlns:aink="http://schemas.microsoft.com/office/drawing/2016/ink" xmlns:am3d="http://schemas.microsoft.com/office/drawing/2017/model3d" xmlns:o="urn:schemas-microsoft-com:office:office" xmlns:oel="http://schemas.microsoft.com/office/2019/extlst" xmlns:r="http://schemas.openxmlformats.org/officeDocument/2006/relationships" xmlns:m="http://schemas.openxmlformats.org/officeDocument/2006/math" xmlns:v="urn:schemas-microsoft-com:vml" xmlns:wp14="http://schemas.microsoft.com/office/word/2010/wordprocessingDrawing" xmlns:wp="http://schemas.openxmlformats.org/drawingml/2006/wordprocessingDrawing" xmlns:w10="urn:schemas-microsoft-com:office:word" xmlns:w="http://schemas.openxmlformats.org/wordprocessingml/2006/main" xmlns:w14="http://schemas.microsoft.com/office/word/2010/wordml" xmlns:w15="http://schemas.microsoft.com/office/word/2012/wordml" xmlns:w16cex="http://schemas.microsoft.com/office/word/2018/wordml/cex" xmlns:w16cid="http://schemas.microsoft.com/office/word/2016/wordml/cid" xmlns:w16="http://schemas.microsoft.com/office/word/2018/wordml" xmlns:w16du="http://schemas.microsoft.com/office/word/2023/wordml/word16du" xmlns:w16sdtdh="http://schemas.microsoft.com/office/word/2020/wordml/sdtdatahash" xmlns:w16sdtfl="http://schemas.microsoft.com/office/word/2024/wordml/sdtformatlock" xmlns:w16se="http://schemas.microsoft.com/office/word/2015/wordml/symex" xmlns:wpg="http://schemas.microsoft.com/office/word/2010/wordprocessingGroup" xmlns:wpi="http://schemas.microsoft.com/office/word/2010/wordprocessingInk" xmlns:wne="http://schemas.microsoft.com/office/word/2006/wordml" xmlns:wps="http://schemas.microsoft.com/office/word/2010/wordprocessingShape" mc:Ignorable="w14 w15 w16se w16cid w16 w16cex w16sdtdh w16sdtfl w16du wp14">
-  <w:p>
-    <w:pPr>
-      <w:pStyle w:val="Footer"/>
-    </w:pPr>
-  </w:p>
-</w:ftr>
-</file>
-
-<file path=word/footer3.xml><?xml version="1.0" encoding="utf-8"?>
-<w:ftr xmlns:wpc="http://schemas.microsoft.com/office/word/2010/wordprocessingCanvas" xmlns:cx="http://schemas.microsoft.com/office/drawing/2014/chartex" xmlns:cx1="http://schemas.microsoft.com/office/drawing/2015/9/8/chartex" xmlns:cx2="http://schemas.microsoft.com/office/drawing/2015/10/21/chartex" xmlns:cx3="http://schemas.microsoft.com/office/drawing/2016/5/9/chartex" xmlns:cx4="http://schemas.microsoft.com/office/drawing/2016/5/10/chartex" xmlns:cx5="http://schemas.microsoft.com/office/drawing/2016/5/11/chartex" xmlns:cx6="http://schemas.microsoft.com/office/drawing/2016/5/12/chartex" xmlns:cx7="http://schemas.microsoft.com/office/drawing/2016/5/13/chartex" xmlns:cx8="http://schemas.microsoft.com/office/drawing/2016/5/14/chartex" xmlns:mc="http://schemas.openxmlformats.org/markup-compatibility/2006" xmlns:aink="http://schemas.microsoft.com/office/drawing/2016/ink" xmlns:am3d="http://schemas.microsoft.com/office/drawing/2017/model3d" xmlns:o="urn:schemas-microsoft-com:office:office" xmlns:oel="http://schemas.microsoft.com/office/2019/extlst" xmlns:r="http://schemas.openxmlformats.org/officeDocument/2006/relationships" xmlns:m="http://schemas.openxmlformats.org/officeDocument/2006/math" xmlns:v="urn:schemas-microsoft-com:vml" xmlns:wp14="http://schemas.microsoft.com/office/word/2010/wordprocessingDrawing" xmlns:wp="http://schemas.openxmlformats.org/drawingml/2006/wordprocessingDrawing" xmlns:w10="urn:schemas-microsoft-com:office:word" xmlns:w="http://schemas.openxmlformats.org/wordprocessingml/2006/main" xmlns:w14="http://schemas.microsoft.com/office/word/2010/wordml" xmlns:w15="http://schemas.microsoft.com/office/word/2012/wordml" xmlns:w16cex="http://schemas.microsoft.com/office/word/2018/wordml/cex" xmlns:w16cid="http://schemas.microsoft.com/office/word/2016/wordml/cid" xmlns:w16="http://schemas.microsoft.com/office/word/2018/wordml" xmlns:w16du="http://schemas.microsoft.com/office/word/2023/wordml/word16du" xmlns:w16sdtdh="http://schemas.microsoft.com/office/word/2020/wordml/sdtdatahash" xmlns:w16sdtfl="http://schemas.microsoft.com/office/word/2024/wordml/sdtformatlock" xmlns:w16se="http://schemas.microsoft.com/office/word/2015/wordml/symex" xmlns:wpg="http://schemas.microsoft.com/office/word/2010/wordprocessingGroup" xmlns:wpi="http://schemas.microsoft.com/office/word/2010/wordprocessingInk" xmlns:wne="http://schemas.microsoft.com/office/word/2006/wordml" xmlns:wps="http://schemas.microsoft.com/office/word/2010/wordprocessingShape" mc:Ignorable="w14 w15 w16se w16cid w16 w16cex w16sdtdh w16sdtfl w16du wp14">
-  <w:p>
-    <w:pPr>
-      <w:pStyle w:val="Footer"/>
-    </w:pPr>
-  </w:p>
-</w:ftr>
-</file>
-
 <file path=word/footnotes.xml><?xml version="1.0" encoding="utf-8"?>
 <w:footnotes xmlns:wpc="http://schemas.microsoft.com/office/word/2010/wordprocessingCanvas" xmlns:cx="http://schemas.microsoft.com/office/drawing/2014/chartex" xmlns:cx1="http://schemas.microsoft.com/office/drawing/2015/9/8/chartex" xmlns:cx2="http://schemas.microsoft.com/office/drawing/2015/10/21/chartex" xmlns:cx3="http://schemas.microsoft.com/office/drawing/2016/5/9/chartex" xmlns:cx4="http://schemas.microsoft.com/office/drawing/2016/5/10/chartex" xmlns:cx5="http://schemas.microsoft.com/office/drawing/2016/5/11/chartex" xmlns:cx6="http://schemas.microsoft.com/office/drawing/2016/5/12/chartex" xmlns:cx7="http://schemas.microsoft.com/office/drawing/2016/5/13/chartex" xmlns:cx8="http://schemas.microsoft.com/office/drawing/2016/5/14/chartex" xmlns:mc="http://schemas.openxmlformats.org/markup-compatibility/2006" xmlns:aink="http://schemas.microsoft.com/office/drawing/2016/ink" xmlns:am3d="http://schemas.microsoft.com/office/drawing/2017/model3d" xmlns:o="urn:schemas-microsoft-com:office:office" xmlns:oel="http://schemas.microsoft.com/office/2019/extlst" xmlns:r="http://schemas.openxmlformats.org/officeDocument/2006/relationships" xmlns:m="http://schemas.openxmlformats.org/officeDocument/2006/math" xmlns:v="urn:schemas-microsoft-com:vml" xmlns:wp14="http://schemas.microsoft.com/office/word/2010/wordprocessingDrawing" xmlns:wp="http://schemas.openxmlformats.org/drawingml/2006/wordprocessingDrawing" xmlns:w10="urn:schemas-microsoft-com:office:word" xmlns:w="http://schemas.openxmlformats.org/wordprocessingml/2006/main" xmlns:w14="http://schemas.microsoft.com/office/word/2010/wordml" xmlns:w15="http://schemas.microsoft.com/office/word/2012/wordml" xmlns:w16cex="http://schemas.microsoft.com/office/word/2018/wordml/cex" xmlns:w16cid="http://schemas.microsoft.com/office/word/2016/wordml/cid" xmlns:w16="http://schemas.microsoft.com/office/word/2018/wordml" xmlns:w16du="http://schemas.microsoft.com/office/word/2023/wordml/word16du" xmlns:w16sdtdh="http://schemas.microsoft.com/office/word/2020/wordml/sdtdatahash" xmlns:w16sdtfl="http://schemas.microsoft.com/office/word/2024/wordml/sdtformatlock" xmlns:w16se="http://schemas.microsoft.com/office/word/2015/wordml/symex" xmlns:wpg="http://schemas.microsoft.com/office/word/2010/wordprocessingGroup" xmlns:wpi="http://schemas.microsoft.com/office/word/2010/wordprocessingInk" xmlns:wne="http://schemas.microsoft.com/office/word/2006/wordml" xmlns:wps="http://schemas.microsoft.com/office/word/2010/wordprocessingShape" mc:Ignorable="w14 w15 w16se w16cid w16 w16cex w16sdtdh w16sdtfl w16du wp14">
   <w:footnote w:type="separator" w:id="-1">
@@ -1670,36 +1328,6 @@
     </w:p>
   </w:footnote>
 </w:footnotes>
-</file>
-
-<file path=word/header1.xml><?xml version="1.0" encoding="utf-8"?>
-<w:hdr xmlns:wpc="http://schemas.microsoft.com/office/word/2010/wordprocessingCanvas" xmlns:cx="http://schemas.microsoft.com/office/drawing/2014/chartex" xmlns:cx1="http://schemas.microsoft.com/office/drawing/2015/9/8/chartex" xmlns:cx2="http://schemas.microsoft.com/office/drawing/2015/10/21/chartex" xmlns:cx3="http://schemas.microsoft.com/office/drawing/2016/5/9/chartex" xmlns:cx4="http://schemas.microsoft.com/office/drawing/2016/5/10/chartex" xmlns:cx5="http://schemas.microsoft.com/office/drawing/2016/5/11/chartex" xmlns:cx6="http://schemas.microsoft.com/office/drawing/2016/5/12/chartex" xmlns:cx7="http://schemas.microsoft.com/office/drawing/2016/5/13/chartex" xmlns:cx8="http://schemas.microsoft.com/office/drawing/2016/5/14/chartex" xmlns:mc="http://schemas.openxmlformats.org/markup-compatibility/2006" xmlns:aink="http://schemas.microsoft.com/office/drawing/2016/ink" xmlns:am3d="http://schemas.microsoft.com/office/drawing/2017/model3d" xmlns:o="urn:schemas-microsoft-com:office:office" xmlns:oel="http://schemas.microsoft.com/office/2019/extlst" xmlns:r="http://schemas.openxmlformats.org/officeDocument/2006/relationships" xmlns:m="http://schemas.openxmlformats.org/officeDocument/2006/math" xmlns:v="urn:schemas-microsoft-com:vml" xmlns:wp14="http://schemas.microsoft.com/office/word/2010/wordprocessingDrawing" xmlns:wp="http://schemas.openxmlformats.org/drawingml/2006/wordprocessingDrawing" xmlns:w10="urn:schemas-microsoft-com:office:word" xmlns:w="http://schemas.openxmlformats.org/wordprocessingml/2006/main" xmlns:w14="http://schemas.microsoft.com/office/word/2010/wordml" xmlns:w15="http://schemas.microsoft.com/office/word/2012/wordml" xmlns:w16cex="http://schemas.microsoft.com/office/word/2018/wordml/cex" xmlns:w16cid="http://schemas.microsoft.com/office/word/2016/wordml/cid" xmlns:w16="http://schemas.microsoft.com/office/word/2018/wordml" xmlns:w16du="http://schemas.microsoft.com/office/word/2023/wordml/word16du" xmlns:w16sdtdh="http://schemas.microsoft.com/office/word/2020/wordml/sdtdatahash" xmlns:w16sdtfl="http://schemas.microsoft.com/office/word/2024/wordml/sdtformatlock" xmlns:w16se="http://schemas.microsoft.com/office/word/2015/wordml/symex" xmlns:wpg="http://schemas.microsoft.com/office/word/2010/wordprocessingGroup" xmlns:wpi="http://schemas.microsoft.com/office/word/2010/wordprocessingInk" xmlns:wne="http://schemas.microsoft.com/office/word/2006/wordml" xmlns:wps="http://schemas.microsoft.com/office/word/2010/wordprocessingShape" mc:Ignorable="w14 w15 w16se w16cid w16 w16cex w16sdtdh w16sdtfl w16du wp14">
-  <w:p>
-    <w:pPr>
-      <w:pStyle w:val="Header"/>
-    </w:pPr>
-  </w:p>
-</w:hdr>
-</file>
-
-<file path=word/header2.xml><?xml version="1.0" encoding="utf-8"?>
-<w:hdr xmlns:wpc="http://schemas.microsoft.com/office/word/2010/wordprocessingCanvas" xmlns:cx="http://schemas.microsoft.com/office/drawing/2014/chartex" xmlns:cx1="http://schemas.microsoft.com/office/drawing/2015/9/8/chartex" xmlns:cx2="http://schemas.microsoft.com/office/drawing/2015/10/21/chartex" xmlns:cx3="http://schemas.microsoft.com/office/drawing/2016/5/9/chartex" xmlns:cx4="http://schemas.microsoft.com/office/drawing/2016/5/10/chartex" xmlns:cx5="http://schemas.microsoft.com/office/drawing/2016/5/11/chartex" xmlns:cx6="http://schemas.microsoft.com/office/drawing/2016/5/12/chartex" xmlns:cx7="http://schemas.microsoft.com/office/drawing/2016/5/13/chartex" xmlns:cx8="http://schemas.microsoft.com/office/drawing/2016/5/14/chartex" xmlns:mc="http://schemas.openxmlformats.org/markup-compatibility/2006" xmlns:aink="http://schemas.microsoft.com/office/drawing/2016/ink" xmlns:am3d="http://schemas.microsoft.com/office/drawing/2017/model3d" xmlns:o="urn:schemas-microsoft-com:office:office" xmlns:oel="http://schemas.microsoft.com/office/2019/extlst" xmlns:r="http://schemas.openxmlformats.org/officeDocument/2006/relationships" xmlns:m="http://schemas.openxmlformats.org/officeDocument/2006/math" xmlns:v="urn:schemas-microsoft-com:vml" xmlns:wp14="http://schemas.microsoft.com/office/word/2010/wordprocessingDrawing" xmlns:wp="http://schemas.openxmlformats.org/drawingml/2006/wordprocessingDrawing" xmlns:w10="urn:schemas-microsoft-com:office:word" xmlns:w="http://schemas.openxmlformats.org/wordprocessingml/2006/main" xmlns:w14="http://schemas.microsoft.com/office/word/2010/wordml" xmlns:w15="http://schemas.microsoft.com/office/word/2012/wordml" xmlns:w16cex="http://schemas.microsoft.com/office/word/2018/wordml/cex" xmlns:w16cid="http://schemas.microsoft.com/office/word/2016/wordml/cid" xmlns:w16="http://schemas.microsoft.com/office/word/2018/wordml" xmlns:w16du="http://schemas.microsoft.com/office/word/2023/wordml/word16du" xmlns:w16sdtdh="http://schemas.microsoft.com/office/word/2020/wordml/sdtdatahash" xmlns:w16sdtfl="http://schemas.microsoft.com/office/word/2024/wordml/sdtformatlock" xmlns:w16se="http://schemas.microsoft.com/office/word/2015/wordml/symex" xmlns:wpg="http://schemas.microsoft.com/office/word/2010/wordprocessingGroup" xmlns:wpi="http://schemas.microsoft.com/office/word/2010/wordprocessingInk" xmlns:wne="http://schemas.microsoft.com/office/word/2006/wordml" xmlns:wps="http://schemas.microsoft.com/office/word/2010/wordprocessingShape" mc:Ignorable="w14 w15 w16se w16cid w16 w16cex w16sdtdh w16sdtfl w16du wp14">
-  <w:p>
-    <w:pPr>
-      <w:pStyle w:val="Header"/>
-    </w:pPr>
-  </w:p>
-</w:hdr>
-</file>
-
-<file path=word/header3.xml><?xml version="1.0" encoding="utf-8"?>
-<w:hdr xmlns:wpc="http://schemas.microsoft.com/office/word/2010/wordprocessingCanvas" xmlns:cx="http://schemas.microsoft.com/office/drawing/2014/chartex" xmlns:cx1="http://schemas.microsoft.com/office/drawing/2015/9/8/chartex" xmlns:cx2="http://schemas.microsoft.com/office/drawing/2015/10/21/chartex" xmlns:cx3="http://schemas.microsoft.com/office/drawing/2016/5/9/chartex" xmlns:cx4="http://schemas.microsoft.com/office/drawing/2016/5/10/chartex" xmlns:cx5="http://schemas.microsoft.com/office/drawing/2016/5/11/chartex" xmlns:cx6="http://schemas.microsoft.com/office/drawing/2016/5/12/chartex" xmlns:cx7="http://schemas.microsoft.com/office/drawing/2016/5/13/chartex" xmlns:cx8="http://schemas.microsoft.com/office/drawing/2016/5/14/chartex" xmlns:mc="http://schemas.openxmlformats.org/markup-compatibility/2006" xmlns:aink="http://schemas.microsoft.com/office/drawing/2016/ink" xmlns:am3d="http://schemas.microsoft.com/office/drawing/2017/model3d" xmlns:o="urn:schemas-microsoft-com:office:office" xmlns:oel="http://schemas.microsoft.com/office/2019/extlst" xmlns:r="http://schemas.openxmlformats.org/officeDocument/2006/relationships" xmlns:m="http://schemas.openxmlformats.org/officeDocument/2006/math" xmlns:v="urn:schemas-microsoft-com:vml" xmlns:wp14="http://schemas.microsoft.com/office/word/2010/wordprocessingDrawing" xmlns:wp="http://schemas.openxmlformats.org/drawingml/2006/wordprocessingDrawing" xmlns:w10="urn:schemas-microsoft-com:office:word" xmlns:w="http://schemas.openxmlformats.org/wordprocessingml/2006/main" xmlns:w14="http://schemas.microsoft.com/office/word/2010/wordml" xmlns:w15="http://schemas.microsoft.com/office/word/2012/wordml" xmlns:w16cex="http://schemas.microsoft.com/office/word/2018/wordml/cex" xmlns:w16cid="http://schemas.microsoft.com/office/word/2016/wordml/cid" xmlns:w16="http://schemas.microsoft.com/office/word/2018/wordml" xmlns:w16du="http://schemas.microsoft.com/office/word/2023/wordml/word16du" xmlns:w16sdtdh="http://schemas.microsoft.com/office/word/2020/wordml/sdtdatahash" xmlns:w16sdtfl="http://schemas.microsoft.com/office/word/2024/wordml/sdtformatlock" xmlns:w16se="http://schemas.microsoft.com/office/word/2015/wordml/symex" xmlns:wpg="http://schemas.microsoft.com/office/word/2010/wordprocessingGroup" xmlns:wpi="http://schemas.microsoft.com/office/word/2010/wordprocessingInk" xmlns:wne="http://schemas.microsoft.com/office/word/2006/wordml" xmlns:wps="http://schemas.microsoft.com/office/word/2010/wordprocessingShape" mc:Ignorable="w14 w15 w16se w16cid w16 w16cex w16sdtdh w16sdtfl w16du wp14">
-  <w:p>
-    <w:pPr>
-      <w:pStyle w:val="Header"/>
-    </w:pPr>
-  </w:p>
-</w:hdr>
 </file>
 
 <file path=word/numbering.xml><?xml version="1.0" encoding="utf-8"?>

</xml_diff>